<commit_message>
docs: modify final word doc
</commit_message>
<xml_diff>
--- a/report.docx
+++ b/report.docx
@@ -208,7 +208,6 @@
         </w:rPr>
         <w:t>软件工程</w:t>
       </w:r>
-      <w:proofErr w:type="gramStart"/>
       <w:r>
         <w:rPr>
           <w:rFonts w:eastAsia="黑体" w:hint="eastAsia"/>
@@ -219,7 +218,6 @@
         </w:rPr>
         <w:t xml:space="preserve">　　　　　　　</w:t>
       </w:r>
-      <w:proofErr w:type="gramEnd"/>
       <w:r>
         <w:rPr>
           <w:rFonts w:eastAsia="黑体" w:hint="eastAsia"/>
@@ -280,7 +278,6 @@
         </w:rPr>
         <w:t>温玳宁</w:t>
       </w:r>
-      <w:proofErr w:type="gramStart"/>
       <w:r>
         <w:rPr>
           <w:rFonts w:eastAsia="黑体" w:hint="eastAsia"/>
@@ -291,7 +288,6 @@
         </w:rPr>
         <w:t xml:space="preserve">　　　　</w:t>
       </w:r>
-      <w:proofErr w:type="gramEnd"/>
       <w:r>
         <w:rPr>
           <w:rFonts w:eastAsia="黑体" w:hint="eastAsia"/>
@@ -302,7 +298,6 @@
         </w:rPr>
         <w:t xml:space="preserve">          </w:t>
       </w:r>
-      <w:proofErr w:type="gramStart"/>
       <w:r>
         <w:rPr>
           <w:rFonts w:eastAsia="黑体" w:hint="eastAsia"/>
@@ -313,7 +308,6 @@
         </w:rPr>
         <w:t xml:space="preserve">　　　　　</w:t>
       </w:r>
-      <w:proofErr w:type="gramEnd"/>
     </w:p>
     <w:p>
       <w:pPr>
@@ -325,7 +319,6 @@
           <w:szCs w:val="36"/>
         </w:rPr>
       </w:pPr>
-      <w:proofErr w:type="gramStart"/>
       <w:r>
         <w:rPr>
           <w:rFonts w:eastAsia="黑体" w:hint="eastAsia"/>
@@ -333,17 +326,7 @@
           <w:sz w:val="36"/>
           <w:szCs w:val="36"/>
         </w:rPr>
-        <w:t xml:space="preserve">学　　</w:t>
-      </w:r>
-      <w:proofErr w:type="gramEnd"/>
-      <w:r>
-        <w:rPr>
-          <w:rFonts w:eastAsia="黑体" w:hint="eastAsia"/>
-          <w:color w:val="000000"/>
-          <w:sz w:val="36"/>
-          <w:szCs w:val="36"/>
-        </w:rPr>
-        <w:t>号</w:t>
+        <w:t>学　　号</w:t>
       </w:r>
       <w:r>
         <w:rPr>
@@ -403,7 +386,6 @@
         </w:rPr>
         <w:t xml:space="preserve">           </w:t>
       </w:r>
-      <w:proofErr w:type="gramStart"/>
       <w:r>
         <w:rPr>
           <w:rFonts w:eastAsia="黑体" w:hint="eastAsia"/>
@@ -414,7 +396,6 @@
         </w:rPr>
         <w:t xml:space="preserve">　　　　　　</w:t>
       </w:r>
-      <w:proofErr w:type="gramEnd"/>
     </w:p>
     <w:p>
       <w:pPr>
@@ -453,7 +434,7 @@
           <w:szCs w:val="36"/>
           <w:u w:val="single"/>
         </w:rPr>
-        <w:t>张慧娟</w:t>
+        <w:t>张</w:t>
       </w:r>
       <w:r>
         <w:rPr>
@@ -463,9 +444,8 @@
           <w:szCs w:val="36"/>
           <w:u w:val="single"/>
         </w:rPr>
-        <w:t xml:space="preserve">　　</w:t>
-      </w:r>
-      <w:proofErr w:type="gramStart"/>
+        <w:t>惠</w:t>
+      </w:r>
       <w:r>
         <w:rPr>
           <w:rFonts w:eastAsia="黑体" w:hint="eastAsia"/>
@@ -474,9 +454,8 @@
           <w:szCs w:val="36"/>
           <w:u w:val="single"/>
         </w:rPr>
-        <w:t xml:space="preserve">　</w:t>
-      </w:r>
-      <w:proofErr w:type="gramEnd"/>
+        <w:t>娟</w:t>
+      </w:r>
       <w:r>
         <w:rPr>
           <w:rFonts w:eastAsia="黑体" w:hint="eastAsia"/>
@@ -485,9 +464,8 @@
           <w:szCs w:val="36"/>
           <w:u w:val="single"/>
         </w:rPr>
-        <w:t xml:space="preserve">          </w:t>
-      </w:r>
-      <w:proofErr w:type="gramStart"/>
+        <w:t xml:space="preserve">　　　</w:t>
+      </w:r>
       <w:r>
         <w:rPr>
           <w:rFonts w:eastAsia="黑体" w:hint="eastAsia"/>
@@ -496,31 +474,7 @@
           <w:szCs w:val="36"/>
           <w:u w:val="single"/>
         </w:rPr>
-        <w:t xml:space="preserve">　　　　　　</w:t>
-      </w:r>
-      <w:proofErr w:type="gramEnd"/>
-    </w:p>
-    <w:p>
-      <w:pPr>
-        <w:spacing w:line="800" w:lineRule="exact"/>
-      </w:pPr>
-      <w:r>
-        <w:rPr>
-          <w:rFonts w:eastAsia="黑体" w:hint="eastAsia"/>
-          <w:color w:val="000000"/>
-          <w:sz w:val="36"/>
-          <w:szCs w:val="36"/>
-        </w:rPr>
-        <w:t>日　　期</w:t>
-      </w:r>
-      <w:r>
-        <w:rPr>
-          <w:rFonts w:eastAsia="黑体" w:hint="eastAsia"/>
-          <w:color w:val="000000"/>
-          <w:sz w:val="36"/>
-          <w:szCs w:val="36"/>
-        </w:rPr>
-        <w:t xml:space="preserve">  </w:t>
+        <w:t xml:space="preserve">          </w:t>
       </w:r>
       <w:r>
         <w:rPr>
@@ -530,9 +484,31 @@
           <w:szCs w:val="36"/>
           <w:u w:val="single"/>
         </w:rPr>
-        <w:t xml:space="preserve">2026/05/13           </w:t>
-      </w:r>
-      <w:proofErr w:type="gramStart"/>
+        <w:t xml:space="preserve">　　　　　　</w:t>
+      </w:r>
+    </w:p>
+    <w:p>
+      <w:pPr>
+        <w:spacing w:line="800" w:lineRule="exact"/>
+      </w:pPr>
+      <w:r>
+        <w:rPr>
+          <w:rFonts w:eastAsia="黑体" w:hint="eastAsia"/>
+          <w:color w:val="000000"/>
+          <w:sz w:val="36"/>
+          <w:szCs w:val="36"/>
+        </w:rPr>
+        <w:t>日　　期</w:t>
+      </w:r>
+      <w:r>
+        <w:rPr>
+          <w:rFonts w:eastAsia="黑体" w:hint="eastAsia"/>
+          <w:color w:val="000000"/>
+          <w:sz w:val="36"/>
+          <w:szCs w:val="36"/>
+        </w:rPr>
+        <w:t xml:space="preserve">  </w:t>
+      </w:r>
       <w:r>
         <w:rPr>
           <w:rFonts w:eastAsia="黑体" w:hint="eastAsia"/>
@@ -541,18 +517,24 @@
           <w:szCs w:val="36"/>
           <w:u w:val="single"/>
         </w:rPr>
+        <w:t xml:space="preserve">2026/05/13           </w:t>
+      </w:r>
+      <w:r>
+        <w:rPr>
+          <w:rFonts w:eastAsia="黑体" w:hint="eastAsia"/>
+          <w:color w:val="000000"/>
+          <w:sz w:val="36"/>
+          <w:szCs w:val="36"/>
+          <w:u w:val="single"/>
+        </w:rPr>
         <w:t xml:space="preserve">　　　　　　　</w:t>
       </w:r>
-      <w:proofErr w:type="gramEnd"/>
     </w:p>
     <w:p>
       <w:pPr>
         <w:widowControl/>
         <w:spacing w:after="160" w:line="278" w:lineRule="auto"/>
         <w:jc w:val="left"/>
-        <w:rPr>
-          <w:rFonts w:hint="eastAsia"/>
-        </w:rPr>
       </w:pPr>
       <w:r>
         <w:br w:type="page"/>
@@ -1521,7 +1503,7 @@
         <w:spacing w:before="80" w:after="40" w:line="360" w:lineRule="exact"/>
         <w:ind w:firstLine="420"/>
         <w:rPr>
-          <w:rFonts w:ascii="Consolas" w:hAnsi="Consolas" w:hint="eastAsia"/>
+          <w:rFonts w:ascii="Consolas" w:hAnsi="Consolas"/>
           <w:bCs/>
           <w:szCs w:val="21"/>
         </w:rPr>
@@ -6553,25 +6535,7 @@
           <w:color w:val="1F2937"/>
           <w:sz w:val="17"/>
         </w:rPr>
-        <w:t xml:space="preserve">CREATE TABLE </w:t>
-      </w:r>
-      <w:proofErr w:type="gramStart"/>
-      <w:r>
-        <w:rPr>
-          <w:rFonts w:ascii="Consolas" w:hAnsi="Consolas"/>
-          <w:color w:val="1F2937"/>
-          <w:sz w:val="17"/>
-        </w:rPr>
-        <w:t>IF NOT</w:t>
-      </w:r>
-      <w:proofErr w:type="gramEnd"/>
-      <w:r>
-        <w:rPr>
-          <w:rFonts w:ascii="Consolas" w:hAnsi="Consolas"/>
-          <w:color w:val="1F2937"/>
-          <w:sz w:val="17"/>
-        </w:rPr>
-        <w:t xml:space="preserve"> EXISTS completed_requests (</w:t>
+        <w:t>CREATE TABLE IF NOT EXISTS completed_requests (</w:t>
       </w:r>
       <w:r>
         <w:br/>
@@ -9009,13 +8973,8 @@
       <w:r>
         <w:t xml:space="preserve">SCAN </w:t>
       </w:r>
-      <w:proofErr w:type="gramStart"/>
-      <w:r>
-        <w:t>不只让</w:t>
-      </w:r>
-      <w:proofErr w:type="gramEnd"/>
-      <w:r>
-        <w:t>空闲电梯接单。已有停靠计划的电梯如果</w:t>
+      <w:r>
+        <w:t>不只让空闲电梯接单。已有停靠计划的电梯如果</w:t>
       </w:r>
       <w:r>
         <w:t>“</w:t>
@@ -10529,17 +10488,8 @@
                 <w:b/>
                 <w:sz w:val="19"/>
               </w:rPr>
-              <w:t>总</w:t>
-            </w:r>
-            <w:proofErr w:type="gramStart"/>
-            <w:r>
-              <w:rPr>
-                <w:b/>
-                <w:sz w:val="19"/>
-              </w:rPr>
-              <w:t>耗时第</w:t>
-            </w:r>
-            <w:proofErr w:type="gramEnd"/>
+              <w:t>总耗时第</w:t>
+            </w:r>
             <w:r>
               <w:rPr>
                 <w:b/>
@@ -11299,13 +11249,8 @@
       <w:r>
         <w:t xml:space="preserve"> 101 </w:t>
       </w:r>
-      <w:proofErr w:type="gramStart"/>
-      <w:r>
-        <w:t>个</w:t>
-      </w:r>
-      <w:proofErr w:type="gramEnd"/>
-      <w:r>
-        <w:t>请求，因此本组数据具备横向比较基础。</w:t>
+      <w:r>
+        <w:t>个请求，因此本组数据具备横向比较基础。</w:t>
       </w:r>
       <w:r>
         <w:t xml:space="preserve">First Available </w:t>
@@ -15525,9 +15470,6 @@
       <w:pPr>
         <w:spacing w:before="120" w:after="120" w:line="280" w:lineRule="exact"/>
         <w:jc w:val="left"/>
-        <w:rPr>
-          <w:rFonts w:hint="eastAsia"/>
-        </w:rPr>
       </w:pPr>
       <w:r>
         <w:rPr>

</xml_diff>